<commit_message>
feat(state): implement in-memory stateful collections and add comprehensive documentation
- Implement stateful runtime and lifecycle management in src/modules/state
- Add operation resolver to infer CRUD operations (list, create, read, patch, replace, delete)
- Support query filtering, search, and pagination behaviors for collection lists
- Guarantee deterministic seed generation and unique identifier assignment via PRNG
- Add startup agreement validation rules for collection endpoints in stateful-validator
- Wire stateful request execution into Fastify route registrar and server
- Add unit and end-to-end journey test suites in tests/state/
- Add detailed JSDoc documentation, type annotations, and practical examples to all state functions
</commit_message>
<xml_diff>
--- a/templates/API_Agreement_Template.docx
+++ b/templates/API_Agreement_Template.docx
@@ -35,7 +35,7 @@
     </w:p>
     <w:p>
       <w:r>
-        <w:t>Types: string, integer, number, boolean, object, array. Locations: path, query, header, body. Define parent objects and arrays before children. Use data[].id for a field in each array item; use tags[] to define primitive array items.</w:t>
+        <w:t>Types: string, integer, number, boolean, object, array. Locations: path, query, header, body. Define parent objects and arrays before children. Use data[].id for a field in each array item; use tags[] to define primitive array items. The optional Behavior column supports filter=&lt;field&gt;, search=&lt;field&gt;, page, and pageSize on query fields.</w:t>
       </w:r>
     </w:p>
     <w:p>
@@ -45,7 +45,7 @@
     </w:p>
     <w:p>
       <w:r>
-        <w:t>Error triggers: validation for invalid requests, selected for a configured response scenario. Repeat the status and trigger for every field in that error body. In v1, a validation error body uses a required message string containing actual validation details.</w:t>
+        <w:t>Error triggers: validation for invalid requests, selected for a configured response scenario, and not_found for a missing stateful record. Repeat the status and trigger for every field in that error body.</w:t>
       </w:r>
     </w:p>
     <w:p>
@@ -55,7 +55,7 @@
     </w:p>
     <w:p>
       <w:r>
-        <w:t>General v1 rules: unknown query/body fields are rejected; unrelated HTTP headers are allowed. Declared headers are validated. Body types are not coerced. Dummy response fields are generated independently; no records, filtering, or business workflows are stored.</w:t>
+        <w:t>General v1 rules: endpoints with the same Collection share in-memory records until the server restarts. Use - to keep an endpoint stateless. Unknown query and body fields are rejected; unrelated HTTP headers are allowed. Declared headers are validated and body types are not coerced.</w:t>
       </w:r>
     </w:p>
     <w:p>
@@ -81,7 +81,7 @@
         <w:spacing w:after="40"/>
       </w:pPr>
       <w:r>
-        <w:t>Method: [GET / POST / PATCH / DELETE]</w:t>
+        <w:t>Method: [GET / POST / PUT / PATCH / DELETE]</w:t>
       </w:r>
     </w:p>
     <w:p>
@@ -93,11 +93,17 @@
       </w:r>
     </w:p>
     <w:p>
+      <w:pPr/>
+      <w:r>
+        <w:t>Collection: [collection name or -]</w:t>
+      </w:r>
+    </w:p>
+    <w:p>
       <w:pPr>
         <w:spacing w:after="40"/>
       </w:pPr>
       <w:r>
-        <w:t>Authentication: [none / bearer]</w:t>
+        <w:t>Authentication: [none / bearer / required]</w:t>
       </w:r>
     </w:p>
     <w:p>
@@ -140,12 +146,13 @@
         <w:tblLook w:firstColumn="1" w:firstRow="1" w:lastColumn="0" w:lastRow="0" w:noHBand="0" w:noVBand="1" w:val="04A0"/>
       </w:tblPr>
       <w:tblGrid>
-        <w:gridCol w:w="1512"/>
+        <w:gridCol w:w="1440"/>
         <w:gridCol w:w="936"/>
         <w:gridCol w:w="1008"/>
         <w:gridCol w:w="936"/>
         <w:gridCol w:w="936"/>
-        <w:gridCol w:w="4320"/>
+        <w:gridCol w:w="2880"/>
+        <w:gridCol w:w="2376"/>
       </w:tblGrid>
       <w:tr>
         <w:trPr>
@@ -154,25 +161,30 @@
         </w:trPr>
         <w:tc>
           <w:tcPr>
-            <w:tcW w:type="dxa" w:w="1512"/>
+            <w:tcW w:type="dxa" w:w="1440"/>
             <w:vAlign w:val="center"/>
             <w:tcMar>
-              <w:top w:w="75" w:type="dxa"/>
+              <w:top w:w="80" w:type="dxa"/>
               <w:left w:w="75" w:type="dxa"/>
-              <w:bottom w:w="75" w:type="dxa"/>
+              <w:bottom w:w="80" w:type="dxa"/>
               <w:right w:w="75" w:type="dxa"/>
+              <w:start w:w="90" w:type="dxa"/>
+              <w:end w:w="90" w:type="dxa"/>
             </w:tcMar>
             <w:tcBorders>
               <w:top w:val="single" w:sz="4" w:color="D9D9D9"/>
               <w:left w:val="single" w:sz="4" w:color="D9D9D9"/>
               <w:bottom w:val="single" w:sz="4" w:color="D9D9D9"/>
               <w:right w:val="single" w:sz="4" w:color="D9D9D9"/>
+              <w:insideH w:val="single" w:sz="4" w:color="D9D9D9"/>
+              <w:insideV w:val="single" w:sz="4" w:color="D9D9D9"/>
             </w:tcBorders>
             <w:shd w:fill="E5EDF4"/>
           </w:tcPr>
           <w:p>
             <w:pPr>
-              <w:spacing w:after="20" w:line="240" w:lineRule="auto"/>
+              <w:spacing w:after="0" w:line="240" w:lineRule="auto" w:before="0"/>
+              <w:jc w:val="left"/>
             </w:pPr>
             <w:r>
               <w:rPr>
@@ -188,22 +200,27 @@
             <w:tcW w:type="dxa" w:w="936"/>
             <w:vAlign w:val="center"/>
             <w:tcMar>
-              <w:top w:w="75" w:type="dxa"/>
+              <w:top w:w="80" w:type="dxa"/>
               <w:left w:w="75" w:type="dxa"/>
-              <w:bottom w:w="75" w:type="dxa"/>
+              <w:bottom w:w="80" w:type="dxa"/>
               <w:right w:w="75" w:type="dxa"/>
+              <w:start w:w="90" w:type="dxa"/>
+              <w:end w:w="90" w:type="dxa"/>
             </w:tcMar>
             <w:tcBorders>
               <w:top w:val="single" w:sz="4" w:color="D9D9D9"/>
               <w:left w:val="single" w:sz="4" w:color="D9D9D9"/>
               <w:bottom w:val="single" w:sz="4" w:color="D9D9D9"/>
               <w:right w:val="single" w:sz="4" w:color="D9D9D9"/>
+              <w:insideH w:val="single" w:sz="4" w:color="D9D9D9"/>
+              <w:insideV w:val="single" w:sz="4" w:color="D9D9D9"/>
             </w:tcBorders>
             <w:shd w:fill="E5EDF4"/>
           </w:tcPr>
           <w:p>
             <w:pPr>
-              <w:spacing w:after="20" w:line="240" w:lineRule="auto"/>
+              <w:spacing w:after="0" w:line="240" w:lineRule="auto" w:before="0"/>
+              <w:jc w:val="center"/>
             </w:pPr>
             <w:r>
               <w:rPr>
@@ -219,22 +236,27 @@
             <w:tcW w:type="dxa" w:w="1008"/>
             <w:vAlign w:val="center"/>
             <w:tcMar>
-              <w:top w:w="75" w:type="dxa"/>
+              <w:top w:w="80" w:type="dxa"/>
               <w:left w:w="75" w:type="dxa"/>
-              <w:bottom w:w="75" w:type="dxa"/>
+              <w:bottom w:w="80" w:type="dxa"/>
               <w:right w:w="75" w:type="dxa"/>
+              <w:start w:w="90" w:type="dxa"/>
+              <w:end w:w="90" w:type="dxa"/>
             </w:tcMar>
             <w:tcBorders>
               <w:top w:val="single" w:sz="4" w:color="D9D9D9"/>
               <w:left w:val="single" w:sz="4" w:color="D9D9D9"/>
               <w:bottom w:val="single" w:sz="4" w:color="D9D9D9"/>
               <w:right w:val="single" w:sz="4" w:color="D9D9D9"/>
+              <w:insideH w:val="single" w:sz="4" w:color="D9D9D9"/>
+              <w:insideV w:val="single" w:sz="4" w:color="D9D9D9"/>
             </w:tcBorders>
             <w:shd w:fill="E5EDF4"/>
           </w:tcPr>
           <w:p>
             <w:pPr>
-              <w:spacing w:after="20" w:line="240" w:lineRule="auto"/>
+              <w:spacing w:after="0" w:line="240" w:lineRule="auto" w:before="0"/>
+              <w:jc w:val="center"/>
             </w:pPr>
             <w:r>
               <w:rPr>
@@ -250,22 +272,27 @@
             <w:tcW w:type="dxa" w:w="936"/>
             <w:vAlign w:val="center"/>
             <w:tcMar>
-              <w:top w:w="75" w:type="dxa"/>
+              <w:top w:w="80" w:type="dxa"/>
               <w:left w:w="75" w:type="dxa"/>
-              <w:bottom w:w="75" w:type="dxa"/>
+              <w:bottom w:w="80" w:type="dxa"/>
               <w:right w:w="75" w:type="dxa"/>
+              <w:start w:w="90" w:type="dxa"/>
+              <w:end w:w="90" w:type="dxa"/>
             </w:tcMar>
             <w:tcBorders>
               <w:top w:val="single" w:sz="4" w:color="D9D9D9"/>
               <w:left w:val="single" w:sz="4" w:color="D9D9D9"/>
               <w:bottom w:val="single" w:sz="4" w:color="D9D9D9"/>
               <w:right w:val="single" w:sz="4" w:color="D9D9D9"/>
+              <w:insideH w:val="single" w:sz="4" w:color="D9D9D9"/>
+              <w:insideV w:val="single" w:sz="4" w:color="D9D9D9"/>
             </w:tcBorders>
             <w:shd w:fill="E5EDF4"/>
           </w:tcPr>
           <w:p>
             <w:pPr>
-              <w:spacing w:after="20" w:line="240" w:lineRule="auto"/>
+              <w:spacing w:after="0" w:line="240" w:lineRule="auto" w:before="0"/>
+              <w:jc w:val="center"/>
             </w:pPr>
             <w:r>
               <w:rPr>
@@ -281,22 +308,27 @@
             <w:tcW w:type="dxa" w:w="936"/>
             <w:vAlign w:val="center"/>
             <w:tcMar>
-              <w:top w:w="75" w:type="dxa"/>
+              <w:top w:w="80" w:type="dxa"/>
               <w:left w:w="75" w:type="dxa"/>
-              <w:bottom w:w="75" w:type="dxa"/>
+              <w:bottom w:w="80" w:type="dxa"/>
               <w:right w:w="75" w:type="dxa"/>
+              <w:start w:w="90" w:type="dxa"/>
+              <w:end w:w="90" w:type="dxa"/>
             </w:tcMar>
             <w:tcBorders>
               <w:top w:val="single" w:sz="4" w:color="D9D9D9"/>
               <w:left w:val="single" w:sz="4" w:color="D9D9D9"/>
               <w:bottom w:val="single" w:sz="4" w:color="D9D9D9"/>
               <w:right w:val="single" w:sz="4" w:color="D9D9D9"/>
+              <w:insideH w:val="single" w:sz="4" w:color="D9D9D9"/>
+              <w:insideV w:val="single" w:sz="4" w:color="D9D9D9"/>
             </w:tcBorders>
             <w:shd w:fill="E5EDF4"/>
           </w:tcPr>
           <w:p>
             <w:pPr>
-              <w:spacing w:after="20" w:line="240" w:lineRule="auto"/>
+              <w:spacing w:after="0" w:line="240" w:lineRule="auto" w:before="0"/>
+              <w:jc w:val="center"/>
             </w:pPr>
             <w:r>
               <w:rPr>
@@ -309,25 +341,30 @@
         </w:tc>
         <w:tc>
           <w:tcPr>
-            <w:tcW w:type="dxa" w:w="4320"/>
+            <w:tcW w:type="dxa" w:w="2880"/>
             <w:vAlign w:val="center"/>
             <w:tcMar>
-              <w:top w:w="75" w:type="dxa"/>
+              <w:top w:w="80" w:type="dxa"/>
               <w:left w:w="75" w:type="dxa"/>
-              <w:bottom w:w="75" w:type="dxa"/>
+              <w:bottom w:w="80" w:type="dxa"/>
               <w:right w:w="75" w:type="dxa"/>
+              <w:start w:w="90" w:type="dxa"/>
+              <w:end w:w="90" w:type="dxa"/>
             </w:tcMar>
             <w:tcBorders>
               <w:top w:val="single" w:sz="4" w:color="D9D9D9"/>
               <w:left w:val="single" w:sz="4" w:color="D9D9D9"/>
               <w:bottom w:val="single" w:sz="4" w:color="D9D9D9"/>
               <w:right w:val="single" w:sz="4" w:color="D9D9D9"/>
+              <w:insideH w:val="single" w:sz="4" w:color="D9D9D9"/>
+              <w:insideV w:val="single" w:sz="4" w:color="D9D9D9"/>
             </w:tcBorders>
             <w:shd w:fill="E5EDF4"/>
           </w:tcPr>
           <w:p>
             <w:pPr>
-              <w:spacing w:after="20" w:line="240" w:lineRule="auto"/>
+              <w:spacing w:after="0" w:line="240" w:lineRule="auto" w:before="0"/>
+              <w:jc w:val="center"/>
             </w:pPr>
             <w:r>
               <w:rPr>
@@ -338,6 +375,46 @@
             </w:r>
           </w:p>
         </w:tc>
+        <w:tc>
+          <w:tcPr>
+            <w:tcW w:type="dxa" w:w="2376"/>
+            <w:vAlign w:val="center"/>
+            <w:tcBorders>
+              <w:top w:val="single" w:sz="4" w:color="D9D9D9"/>
+              <w:left w:val="single" w:sz="4" w:color="D9D9D9"/>
+              <w:bottom w:val="single" w:sz="4" w:color="D9D9D9"/>
+              <w:right w:val="single" w:sz="4" w:color="D9D9D9"/>
+              <w:insideH w:val="single" w:sz="4" w:color="D9D9D9"/>
+              <w:insideV w:val="single" w:sz="4" w:color="D9D9D9"/>
+            </w:tcBorders>
+            <w:tcMar>
+              <w:top w:w="80" w:type="dxa"/>
+              <w:start w:w="90" w:type="dxa"/>
+              <w:bottom w:w="80" w:type="dxa"/>
+              <w:end w:w="90" w:type="dxa"/>
+            </w:tcMar>
+            <w:shd w:fill="E5EDF4"/>
+          </w:tcPr>
+          <w:p>
+            <w:pPr>
+              <w:spacing w:before="0" w:after="0"/>
+              <w:jc w:val="left"/>
+            </w:pPr>
+            <w:r>
+              <w:rPr>
+                <w:b/>
+                <w:sz w:val="18"/>
+              </w:rPr>
+            </w:r>
+            <w:r>
+              <w:rPr>
+                <w:b/>
+                <w:sz w:val="18"/>
+              </w:rPr>
+              <w:t>Behavior</w:t>
+            </w:r>
+          </w:p>
+        </w:tc>
       </w:tr>
       <w:tr>
         <w:trPr>
@@ -345,25 +422,30 @@
         </w:trPr>
         <w:tc>
           <w:tcPr>
-            <w:tcW w:type="dxa" w:w="1512"/>
+            <w:tcW w:type="dxa" w:w="1440"/>
             <w:vAlign w:val="center"/>
             <w:tcMar>
-              <w:top w:w="75" w:type="dxa"/>
+              <w:top w:w="80" w:type="dxa"/>
               <w:left w:w="75" w:type="dxa"/>
-              <w:bottom w:w="75" w:type="dxa"/>
+              <w:bottom w:w="80" w:type="dxa"/>
               <w:right w:w="75" w:type="dxa"/>
+              <w:start w:w="90" w:type="dxa"/>
+              <w:end w:w="90" w:type="dxa"/>
             </w:tcMar>
             <w:tcBorders>
               <w:top w:val="single" w:sz="4" w:color="D9D9D9"/>
               <w:left w:val="single" w:sz="4" w:color="D9D9D9"/>
               <w:bottom w:val="single" w:sz="4" w:color="D9D9D9"/>
               <w:right w:val="single" w:sz="4" w:color="D9D9D9"/>
+              <w:insideH w:val="single" w:sz="4" w:color="D9D9D9"/>
+              <w:insideV w:val="single" w:sz="4" w:color="D9D9D9"/>
             </w:tcBorders>
             <w:shd w:fill="FFFFFF"/>
           </w:tcPr>
           <w:p>
             <w:pPr>
-              <w:spacing w:after="20" w:line="240" w:lineRule="auto"/>
+              <w:spacing w:after="0" w:line="240" w:lineRule="auto" w:before="0"/>
+              <w:jc w:val="left"/>
             </w:pPr>
             <w:r>
               <w:rPr>
@@ -379,22 +461,27 @@
             <w:tcW w:type="dxa" w:w="936"/>
             <w:vAlign w:val="center"/>
             <w:tcMar>
-              <w:top w:w="75" w:type="dxa"/>
+              <w:top w:w="80" w:type="dxa"/>
               <w:left w:w="75" w:type="dxa"/>
-              <w:bottom w:w="75" w:type="dxa"/>
+              <w:bottom w:w="80" w:type="dxa"/>
               <w:right w:w="75" w:type="dxa"/>
+              <w:start w:w="90" w:type="dxa"/>
+              <w:end w:w="90" w:type="dxa"/>
             </w:tcMar>
             <w:tcBorders>
               <w:top w:val="single" w:sz="4" w:color="D9D9D9"/>
               <w:left w:val="single" w:sz="4" w:color="D9D9D9"/>
               <w:bottom w:val="single" w:sz="4" w:color="D9D9D9"/>
               <w:right w:val="single" w:sz="4" w:color="D9D9D9"/>
+              <w:insideH w:val="single" w:sz="4" w:color="D9D9D9"/>
+              <w:insideV w:val="single" w:sz="4" w:color="D9D9D9"/>
             </w:tcBorders>
             <w:shd w:fill="FFFFFF"/>
           </w:tcPr>
           <w:p>
             <w:pPr>
-              <w:spacing w:after="20" w:line="240" w:lineRule="auto"/>
+              <w:spacing w:after="0" w:line="240" w:lineRule="auto" w:before="0"/>
+              <w:jc w:val="center"/>
             </w:pPr>
             <w:r>
               <w:rPr>
@@ -410,22 +497,27 @@
             <w:tcW w:type="dxa" w:w="1008"/>
             <w:vAlign w:val="center"/>
             <w:tcMar>
-              <w:top w:w="75" w:type="dxa"/>
+              <w:top w:w="80" w:type="dxa"/>
               <w:left w:w="75" w:type="dxa"/>
-              <w:bottom w:w="75" w:type="dxa"/>
+              <w:bottom w:w="80" w:type="dxa"/>
               <w:right w:w="75" w:type="dxa"/>
+              <w:start w:w="90" w:type="dxa"/>
+              <w:end w:w="90" w:type="dxa"/>
             </w:tcMar>
             <w:tcBorders>
               <w:top w:val="single" w:sz="4" w:color="D9D9D9"/>
               <w:left w:val="single" w:sz="4" w:color="D9D9D9"/>
               <w:bottom w:val="single" w:sz="4" w:color="D9D9D9"/>
               <w:right w:val="single" w:sz="4" w:color="D9D9D9"/>
+              <w:insideH w:val="single" w:sz="4" w:color="D9D9D9"/>
+              <w:insideV w:val="single" w:sz="4" w:color="D9D9D9"/>
             </w:tcBorders>
             <w:shd w:fill="FFFFFF"/>
           </w:tcPr>
           <w:p>
             <w:pPr>
-              <w:spacing w:after="20" w:line="240" w:lineRule="auto"/>
+              <w:spacing w:after="0" w:line="240" w:lineRule="auto" w:before="0"/>
+              <w:jc w:val="center"/>
             </w:pPr>
             <w:r>
               <w:rPr>
@@ -441,22 +533,27 @@
             <w:tcW w:type="dxa" w:w="936"/>
             <w:vAlign w:val="center"/>
             <w:tcMar>
-              <w:top w:w="75" w:type="dxa"/>
+              <w:top w:w="80" w:type="dxa"/>
               <w:left w:w="75" w:type="dxa"/>
-              <w:bottom w:w="75" w:type="dxa"/>
+              <w:bottom w:w="80" w:type="dxa"/>
               <w:right w:w="75" w:type="dxa"/>
+              <w:start w:w="90" w:type="dxa"/>
+              <w:end w:w="90" w:type="dxa"/>
             </w:tcMar>
             <w:tcBorders>
               <w:top w:val="single" w:sz="4" w:color="D9D9D9"/>
               <w:left w:val="single" w:sz="4" w:color="D9D9D9"/>
               <w:bottom w:val="single" w:sz="4" w:color="D9D9D9"/>
               <w:right w:val="single" w:sz="4" w:color="D9D9D9"/>
+              <w:insideH w:val="single" w:sz="4" w:color="D9D9D9"/>
+              <w:insideV w:val="single" w:sz="4" w:color="D9D9D9"/>
             </w:tcBorders>
             <w:shd w:fill="FFFFFF"/>
           </w:tcPr>
           <w:p>
             <w:pPr>
-              <w:spacing w:after="20" w:line="240" w:lineRule="auto"/>
+              <w:spacing w:after="0" w:line="240" w:lineRule="auto" w:before="0"/>
+              <w:jc w:val="center"/>
             </w:pPr>
             <w:r>
               <w:rPr>
@@ -472,22 +569,27 @@
             <w:tcW w:type="dxa" w:w="936"/>
             <w:vAlign w:val="center"/>
             <w:tcMar>
-              <w:top w:w="75" w:type="dxa"/>
+              <w:top w:w="80" w:type="dxa"/>
               <w:left w:w="75" w:type="dxa"/>
-              <w:bottom w:w="75" w:type="dxa"/>
+              <w:bottom w:w="80" w:type="dxa"/>
               <w:right w:w="75" w:type="dxa"/>
+              <w:start w:w="90" w:type="dxa"/>
+              <w:end w:w="90" w:type="dxa"/>
             </w:tcMar>
             <w:tcBorders>
               <w:top w:val="single" w:sz="4" w:color="D9D9D9"/>
               <w:left w:val="single" w:sz="4" w:color="D9D9D9"/>
               <w:bottom w:val="single" w:sz="4" w:color="D9D9D9"/>
               <w:right w:val="single" w:sz="4" w:color="D9D9D9"/>
+              <w:insideH w:val="single" w:sz="4" w:color="D9D9D9"/>
+              <w:insideV w:val="single" w:sz="4" w:color="D9D9D9"/>
             </w:tcBorders>
             <w:shd w:fill="FFFFFF"/>
           </w:tcPr>
           <w:p>
             <w:pPr>
-              <w:spacing w:after="20" w:line="240" w:lineRule="auto"/>
+              <w:spacing w:after="0" w:line="240" w:lineRule="auto" w:before="0"/>
+              <w:jc w:val="center"/>
             </w:pPr>
             <w:r>
               <w:rPr>
@@ -500,25 +602,30 @@
         </w:tc>
         <w:tc>
           <w:tcPr>
-            <w:tcW w:type="dxa" w:w="4320"/>
+            <w:tcW w:type="dxa" w:w="2880"/>
             <w:vAlign w:val="center"/>
             <w:tcMar>
-              <w:top w:w="75" w:type="dxa"/>
+              <w:top w:w="80" w:type="dxa"/>
               <w:left w:w="75" w:type="dxa"/>
-              <w:bottom w:w="75" w:type="dxa"/>
+              <w:bottom w:w="80" w:type="dxa"/>
               <w:right w:w="75" w:type="dxa"/>
+              <w:start w:w="90" w:type="dxa"/>
+              <w:end w:w="90" w:type="dxa"/>
             </w:tcMar>
             <w:tcBorders>
               <w:top w:val="single" w:sz="4" w:color="D9D9D9"/>
               <w:left w:val="single" w:sz="4" w:color="D9D9D9"/>
               <w:bottom w:val="single" w:sz="4" w:color="D9D9D9"/>
               <w:right w:val="single" w:sz="4" w:color="D9D9D9"/>
+              <w:insideH w:val="single" w:sz="4" w:color="D9D9D9"/>
+              <w:insideV w:val="single" w:sz="4" w:color="D9D9D9"/>
             </w:tcBorders>
             <w:shd w:fill="FFFFFF"/>
           </w:tcPr>
           <w:p>
             <w:pPr>
-              <w:spacing w:after="20" w:line="240" w:lineRule="auto"/>
+              <w:spacing w:after="0" w:line="240" w:lineRule="auto" w:before="0"/>
+              <w:jc w:val="center"/>
             </w:pPr>
             <w:r>
               <w:rPr>
@@ -526,6 +633,45 @@
                 <w:sz w:val="18"/>
               </w:rPr>
               <w:t>[rules or -]</w:t>
+            </w:r>
+          </w:p>
+        </w:tc>
+        <w:tc>
+          <w:tcPr>
+            <w:tcW w:type="dxa" w:w="2376"/>
+            <w:vAlign w:val="center"/>
+            <w:tcBorders>
+              <w:top w:val="single" w:sz="4" w:color="D9D9D9"/>
+              <w:left w:val="single" w:sz="4" w:color="D9D9D9"/>
+              <w:bottom w:val="single" w:sz="4" w:color="D9D9D9"/>
+              <w:right w:val="single" w:sz="4" w:color="D9D9D9"/>
+              <w:insideH w:val="single" w:sz="4" w:color="D9D9D9"/>
+              <w:insideV w:val="single" w:sz="4" w:color="D9D9D9"/>
+            </w:tcBorders>
+            <w:tcMar>
+              <w:top w:w="80" w:type="dxa"/>
+              <w:start w:w="90" w:type="dxa"/>
+              <w:bottom w:w="80" w:type="dxa"/>
+              <w:end w:w="90" w:type="dxa"/>
+            </w:tcMar>
+            <w:shd w:fill="FFFFFF"/>
+          </w:tcPr>
+          <w:p>
+            <w:pPr>
+              <w:spacing w:before="0" w:after="0"/>
+              <w:jc w:val="left"/>
+            </w:pPr>
+            <w:r>
+              <w:rPr>
+                <w:sz w:val="18"/>
+              </w:rPr>
+            </w:r>
+            <w:r>
+              <w:rPr>
+                <w:b w:val="0"/>
+                <w:sz w:val="18"/>
+              </w:rPr>
+              <w:t>[behavior or -]</w:t>
             </w:r>
           </w:p>
         </w:tc>
@@ -568,22 +714,27 @@
             <w:tcW w:type="dxa" w:w="2304"/>
             <w:vAlign w:val="center"/>
             <w:tcMar>
-              <w:top w:w="75" w:type="dxa"/>
+              <w:top w:w="80" w:type="dxa"/>
               <w:left w:w="75" w:type="dxa"/>
-              <w:bottom w:w="75" w:type="dxa"/>
+              <w:bottom w:w="80" w:type="dxa"/>
               <w:right w:w="75" w:type="dxa"/>
+              <w:start w:w="90" w:type="dxa"/>
+              <w:end w:w="90" w:type="dxa"/>
             </w:tcMar>
             <w:tcBorders>
               <w:top w:val="single" w:sz="4" w:color="D9D9D9"/>
               <w:left w:val="single" w:sz="4" w:color="D9D9D9"/>
               <w:bottom w:val="single" w:sz="4" w:color="D9D9D9"/>
               <w:right w:val="single" w:sz="4" w:color="D9D9D9"/>
+              <w:insideH w:val="single" w:sz="4" w:color="D9D9D9"/>
+              <w:insideV w:val="single" w:sz="4" w:color="D9D9D9"/>
             </w:tcBorders>
             <w:shd w:fill="E5EDF4"/>
           </w:tcPr>
           <w:p>
             <w:pPr>
-              <w:spacing w:after="20" w:line="240" w:lineRule="auto"/>
+              <w:spacing w:after="0" w:line="240" w:lineRule="auto" w:before="0"/>
+              <w:jc w:val="left"/>
             </w:pPr>
             <w:r>
               <w:rPr>
@@ -599,22 +750,27 @@
             <w:tcW w:type="dxa" w:w="1152"/>
             <w:vAlign w:val="center"/>
             <w:tcMar>
-              <w:top w:w="75" w:type="dxa"/>
+              <w:top w:w="80" w:type="dxa"/>
               <w:left w:w="75" w:type="dxa"/>
-              <w:bottom w:w="75" w:type="dxa"/>
+              <w:bottom w:w="80" w:type="dxa"/>
               <w:right w:w="75" w:type="dxa"/>
+              <w:start w:w="90" w:type="dxa"/>
+              <w:end w:w="90" w:type="dxa"/>
             </w:tcMar>
             <w:tcBorders>
               <w:top w:val="single" w:sz="4" w:color="D9D9D9"/>
               <w:left w:val="single" w:sz="4" w:color="D9D9D9"/>
               <w:bottom w:val="single" w:sz="4" w:color="D9D9D9"/>
               <w:right w:val="single" w:sz="4" w:color="D9D9D9"/>
+              <w:insideH w:val="single" w:sz="4" w:color="D9D9D9"/>
+              <w:insideV w:val="single" w:sz="4" w:color="D9D9D9"/>
             </w:tcBorders>
             <w:shd w:fill="E5EDF4"/>
           </w:tcPr>
           <w:p>
             <w:pPr>
-              <w:spacing w:after="20" w:line="240" w:lineRule="auto"/>
+              <w:spacing w:after="0" w:line="240" w:lineRule="auto" w:before="0"/>
+              <w:jc w:val="center"/>
             </w:pPr>
             <w:r>
               <w:rPr>
@@ -630,22 +786,27 @@
             <w:tcW w:type="dxa" w:w="936"/>
             <w:vAlign w:val="center"/>
             <w:tcMar>
-              <w:top w:w="75" w:type="dxa"/>
+              <w:top w:w="80" w:type="dxa"/>
               <w:left w:w="75" w:type="dxa"/>
-              <w:bottom w:w="75" w:type="dxa"/>
+              <w:bottom w:w="80" w:type="dxa"/>
               <w:right w:w="75" w:type="dxa"/>
+              <w:start w:w="90" w:type="dxa"/>
+              <w:end w:w="90" w:type="dxa"/>
             </w:tcMar>
             <w:tcBorders>
               <w:top w:val="single" w:sz="4" w:color="D9D9D9"/>
               <w:left w:val="single" w:sz="4" w:color="D9D9D9"/>
               <w:bottom w:val="single" w:sz="4" w:color="D9D9D9"/>
               <w:right w:val="single" w:sz="4" w:color="D9D9D9"/>
+              <w:insideH w:val="single" w:sz="4" w:color="D9D9D9"/>
+              <w:insideV w:val="single" w:sz="4" w:color="D9D9D9"/>
             </w:tcBorders>
             <w:shd w:fill="E5EDF4"/>
           </w:tcPr>
           <w:p>
             <w:pPr>
-              <w:spacing w:after="20" w:line="240" w:lineRule="auto"/>
+              <w:spacing w:after="0" w:line="240" w:lineRule="auto" w:before="0"/>
+              <w:jc w:val="center"/>
             </w:pPr>
             <w:r>
               <w:rPr>
@@ -661,22 +822,27 @@
             <w:tcW w:type="dxa" w:w="936"/>
             <w:vAlign w:val="center"/>
             <w:tcMar>
-              <w:top w:w="75" w:type="dxa"/>
+              <w:top w:w="80" w:type="dxa"/>
               <w:left w:w="75" w:type="dxa"/>
-              <w:bottom w:w="75" w:type="dxa"/>
+              <w:bottom w:w="80" w:type="dxa"/>
               <w:right w:w="75" w:type="dxa"/>
+              <w:start w:w="90" w:type="dxa"/>
+              <w:end w:w="90" w:type="dxa"/>
             </w:tcMar>
             <w:tcBorders>
               <w:top w:val="single" w:sz="4" w:color="D9D9D9"/>
               <w:left w:val="single" w:sz="4" w:color="D9D9D9"/>
               <w:bottom w:val="single" w:sz="4" w:color="D9D9D9"/>
               <w:right w:val="single" w:sz="4" w:color="D9D9D9"/>
+              <w:insideH w:val="single" w:sz="4" w:color="D9D9D9"/>
+              <w:insideV w:val="single" w:sz="4" w:color="D9D9D9"/>
             </w:tcBorders>
             <w:shd w:fill="E5EDF4"/>
           </w:tcPr>
           <w:p>
             <w:pPr>
-              <w:spacing w:after="20" w:line="240" w:lineRule="auto"/>
+              <w:spacing w:after="0" w:line="240" w:lineRule="auto" w:before="0"/>
+              <w:jc w:val="center"/>
             </w:pPr>
             <w:r>
               <w:rPr>
@@ -692,22 +858,27 @@
             <w:tcW w:type="dxa" w:w="4320"/>
             <w:vAlign w:val="center"/>
             <w:tcMar>
-              <w:top w:w="75" w:type="dxa"/>
+              <w:top w:w="80" w:type="dxa"/>
               <w:left w:w="75" w:type="dxa"/>
-              <w:bottom w:w="75" w:type="dxa"/>
+              <w:bottom w:w="80" w:type="dxa"/>
               <w:right w:w="75" w:type="dxa"/>
+              <w:start w:w="90" w:type="dxa"/>
+              <w:end w:w="90" w:type="dxa"/>
             </w:tcMar>
             <w:tcBorders>
               <w:top w:val="single" w:sz="4" w:color="D9D9D9"/>
               <w:left w:val="single" w:sz="4" w:color="D9D9D9"/>
               <w:bottom w:val="single" w:sz="4" w:color="D9D9D9"/>
               <w:right w:val="single" w:sz="4" w:color="D9D9D9"/>
+              <w:insideH w:val="single" w:sz="4" w:color="D9D9D9"/>
+              <w:insideV w:val="single" w:sz="4" w:color="D9D9D9"/>
             </w:tcBorders>
             <w:shd w:fill="E5EDF4"/>
           </w:tcPr>
           <w:p>
             <w:pPr>
-              <w:spacing w:after="20" w:line="240" w:lineRule="auto"/>
+              <w:spacing w:after="0" w:line="240" w:lineRule="auto" w:before="0"/>
+              <w:jc w:val="left"/>
             </w:pPr>
             <w:r>
               <w:rPr>
@@ -728,22 +899,27 @@
             <w:tcW w:type="dxa" w:w="2304"/>
             <w:vAlign w:val="center"/>
             <w:tcMar>
-              <w:top w:w="75" w:type="dxa"/>
+              <w:top w:w="80" w:type="dxa"/>
               <w:left w:w="75" w:type="dxa"/>
-              <w:bottom w:w="75" w:type="dxa"/>
+              <w:bottom w:w="80" w:type="dxa"/>
               <w:right w:w="75" w:type="dxa"/>
+              <w:start w:w="90" w:type="dxa"/>
+              <w:end w:w="90" w:type="dxa"/>
             </w:tcMar>
             <w:tcBorders>
               <w:top w:val="single" w:sz="4" w:color="D9D9D9"/>
               <w:left w:val="single" w:sz="4" w:color="D9D9D9"/>
               <w:bottom w:val="single" w:sz="4" w:color="D9D9D9"/>
               <w:right w:val="single" w:sz="4" w:color="D9D9D9"/>
+              <w:insideH w:val="single" w:sz="4" w:color="D9D9D9"/>
+              <w:insideV w:val="single" w:sz="4" w:color="D9D9D9"/>
             </w:tcBorders>
             <w:shd w:fill="FFFFFF"/>
           </w:tcPr>
           <w:p>
             <w:pPr>
-              <w:spacing w:after="20" w:line="240" w:lineRule="auto"/>
+              <w:spacing w:after="0" w:line="240" w:lineRule="auto" w:before="0"/>
+              <w:jc w:val="left"/>
             </w:pPr>
             <w:r>
               <w:rPr>
@@ -759,22 +935,27 @@
             <w:tcW w:type="dxa" w:w="1152"/>
             <w:vAlign w:val="center"/>
             <w:tcMar>
-              <w:top w:w="75" w:type="dxa"/>
+              <w:top w:w="80" w:type="dxa"/>
               <w:left w:w="75" w:type="dxa"/>
-              <w:bottom w:w="75" w:type="dxa"/>
+              <w:bottom w:w="80" w:type="dxa"/>
               <w:right w:w="75" w:type="dxa"/>
+              <w:start w:w="90" w:type="dxa"/>
+              <w:end w:w="90" w:type="dxa"/>
             </w:tcMar>
             <w:tcBorders>
               <w:top w:val="single" w:sz="4" w:color="D9D9D9"/>
               <w:left w:val="single" w:sz="4" w:color="D9D9D9"/>
               <w:bottom w:val="single" w:sz="4" w:color="D9D9D9"/>
               <w:right w:val="single" w:sz="4" w:color="D9D9D9"/>
+              <w:insideH w:val="single" w:sz="4" w:color="D9D9D9"/>
+              <w:insideV w:val="single" w:sz="4" w:color="D9D9D9"/>
             </w:tcBorders>
             <w:shd w:fill="FFFFFF"/>
           </w:tcPr>
           <w:p>
             <w:pPr>
-              <w:spacing w:after="20" w:line="240" w:lineRule="auto"/>
+              <w:spacing w:after="0" w:line="240" w:lineRule="auto" w:before="0"/>
+              <w:jc w:val="center"/>
             </w:pPr>
             <w:r>
               <w:rPr>
@@ -790,22 +971,27 @@
             <w:tcW w:type="dxa" w:w="936"/>
             <w:vAlign w:val="center"/>
             <w:tcMar>
-              <w:top w:w="75" w:type="dxa"/>
+              <w:top w:w="80" w:type="dxa"/>
               <w:left w:w="75" w:type="dxa"/>
-              <w:bottom w:w="75" w:type="dxa"/>
+              <w:bottom w:w="80" w:type="dxa"/>
               <w:right w:w="75" w:type="dxa"/>
+              <w:start w:w="90" w:type="dxa"/>
+              <w:end w:w="90" w:type="dxa"/>
             </w:tcMar>
             <w:tcBorders>
               <w:top w:val="single" w:sz="4" w:color="D9D9D9"/>
               <w:left w:val="single" w:sz="4" w:color="D9D9D9"/>
               <w:bottom w:val="single" w:sz="4" w:color="D9D9D9"/>
               <w:right w:val="single" w:sz="4" w:color="D9D9D9"/>
+              <w:insideH w:val="single" w:sz="4" w:color="D9D9D9"/>
+              <w:insideV w:val="single" w:sz="4" w:color="D9D9D9"/>
             </w:tcBorders>
             <w:shd w:fill="FFFFFF"/>
           </w:tcPr>
           <w:p>
             <w:pPr>
-              <w:spacing w:after="20" w:line="240" w:lineRule="auto"/>
+              <w:spacing w:after="0" w:line="240" w:lineRule="auto" w:before="0"/>
+              <w:jc w:val="center"/>
             </w:pPr>
             <w:r>
               <w:rPr>
@@ -821,22 +1007,27 @@
             <w:tcW w:type="dxa" w:w="936"/>
             <w:vAlign w:val="center"/>
             <w:tcMar>
-              <w:top w:w="75" w:type="dxa"/>
+              <w:top w:w="80" w:type="dxa"/>
               <w:left w:w="75" w:type="dxa"/>
-              <w:bottom w:w="75" w:type="dxa"/>
+              <w:bottom w:w="80" w:type="dxa"/>
               <w:right w:w="75" w:type="dxa"/>
+              <w:start w:w="90" w:type="dxa"/>
+              <w:end w:w="90" w:type="dxa"/>
             </w:tcMar>
             <w:tcBorders>
               <w:top w:val="single" w:sz="4" w:color="D9D9D9"/>
               <w:left w:val="single" w:sz="4" w:color="D9D9D9"/>
               <w:bottom w:val="single" w:sz="4" w:color="D9D9D9"/>
               <w:right w:val="single" w:sz="4" w:color="D9D9D9"/>
+              <w:insideH w:val="single" w:sz="4" w:color="D9D9D9"/>
+              <w:insideV w:val="single" w:sz="4" w:color="D9D9D9"/>
             </w:tcBorders>
             <w:shd w:fill="FFFFFF"/>
           </w:tcPr>
           <w:p>
             <w:pPr>
-              <w:spacing w:after="20" w:line="240" w:lineRule="auto"/>
+              <w:spacing w:after="0" w:line="240" w:lineRule="auto" w:before="0"/>
+              <w:jc w:val="center"/>
             </w:pPr>
             <w:r>
               <w:rPr>
@@ -852,22 +1043,27 @@
             <w:tcW w:type="dxa" w:w="4320"/>
             <w:vAlign w:val="center"/>
             <w:tcMar>
-              <w:top w:w="75" w:type="dxa"/>
+              <w:top w:w="80" w:type="dxa"/>
               <w:left w:w="75" w:type="dxa"/>
-              <w:bottom w:w="75" w:type="dxa"/>
+              <w:bottom w:w="80" w:type="dxa"/>
               <w:right w:w="75" w:type="dxa"/>
+              <w:start w:w="90" w:type="dxa"/>
+              <w:end w:w="90" w:type="dxa"/>
             </w:tcMar>
             <w:tcBorders>
               <w:top w:val="single" w:sz="4" w:color="D9D9D9"/>
               <w:left w:val="single" w:sz="4" w:color="D9D9D9"/>
               <w:bottom w:val="single" w:sz="4" w:color="D9D9D9"/>
               <w:right w:val="single" w:sz="4" w:color="D9D9D9"/>
+              <w:insideH w:val="single" w:sz="4" w:color="D9D9D9"/>
+              <w:insideV w:val="single" w:sz="4" w:color="D9D9D9"/>
             </w:tcBorders>
             <w:shd w:fill="FFFFFF"/>
           </w:tcPr>
           <w:p>
             <w:pPr>
-              <w:spacing w:after="20" w:line="240" w:lineRule="auto"/>
+              <w:spacing w:after="0" w:line="240" w:lineRule="auto" w:before="0"/>
+              <w:jc w:val="left"/>
             </w:pPr>
             <w:r>
               <w:rPr>
@@ -919,22 +1115,27 @@
             <w:tcW w:type="dxa" w:w="720"/>
             <w:vAlign w:val="center"/>
             <w:tcMar>
-              <w:top w:w="75" w:type="dxa"/>
+              <w:top w:w="80" w:type="dxa"/>
               <w:left w:w="75" w:type="dxa"/>
-              <w:bottom w:w="75" w:type="dxa"/>
+              <w:bottom w:w="80" w:type="dxa"/>
               <w:right w:w="75" w:type="dxa"/>
+              <w:start w:w="90" w:type="dxa"/>
+              <w:end w:w="90" w:type="dxa"/>
             </w:tcMar>
             <w:tcBorders>
               <w:top w:val="single" w:sz="4" w:color="D9D9D9"/>
               <w:left w:val="single" w:sz="4" w:color="D9D9D9"/>
               <w:bottom w:val="single" w:sz="4" w:color="D9D9D9"/>
               <w:right w:val="single" w:sz="4" w:color="D9D9D9"/>
+              <w:insideH w:val="single" w:sz="4" w:color="D9D9D9"/>
+              <w:insideV w:val="single" w:sz="4" w:color="D9D9D9"/>
             </w:tcBorders>
             <w:shd w:fill="E5EDF4"/>
           </w:tcPr>
           <w:p>
             <w:pPr>
-              <w:spacing w:after="20" w:line="240" w:lineRule="auto"/>
+              <w:spacing w:after="0" w:line="240" w:lineRule="auto" w:before="0"/>
+              <w:jc w:val="left"/>
             </w:pPr>
             <w:r>
               <w:rPr>
@@ -950,22 +1151,27 @@
             <w:tcW w:type="dxa" w:w="1296"/>
             <w:vAlign w:val="center"/>
             <w:tcMar>
-              <w:top w:w="75" w:type="dxa"/>
+              <w:top w:w="80" w:type="dxa"/>
               <w:left w:w="75" w:type="dxa"/>
-              <w:bottom w:w="75" w:type="dxa"/>
+              <w:bottom w:w="80" w:type="dxa"/>
               <w:right w:w="75" w:type="dxa"/>
+              <w:start w:w="90" w:type="dxa"/>
+              <w:end w:w="90" w:type="dxa"/>
             </w:tcMar>
             <w:tcBorders>
               <w:top w:val="single" w:sz="4" w:color="D9D9D9"/>
               <w:left w:val="single" w:sz="4" w:color="D9D9D9"/>
               <w:bottom w:val="single" w:sz="4" w:color="D9D9D9"/>
               <w:right w:val="single" w:sz="4" w:color="D9D9D9"/>
+              <w:insideH w:val="single" w:sz="4" w:color="D9D9D9"/>
+              <w:insideV w:val="single" w:sz="4" w:color="D9D9D9"/>
             </w:tcBorders>
             <w:shd w:fill="E5EDF4"/>
           </w:tcPr>
           <w:p>
             <w:pPr>
-              <w:spacing w:after="20" w:line="240" w:lineRule="auto"/>
+              <w:spacing w:after="0" w:line="240" w:lineRule="auto" w:before="0"/>
+              <w:jc w:val="center"/>
             </w:pPr>
             <w:r>
               <w:rPr>
@@ -981,22 +1187,27 @@
             <w:tcW w:type="dxa" w:w="1296"/>
             <w:vAlign w:val="center"/>
             <w:tcMar>
-              <w:top w:w="75" w:type="dxa"/>
+              <w:top w:w="80" w:type="dxa"/>
               <w:left w:w="75" w:type="dxa"/>
-              <w:bottom w:w="75" w:type="dxa"/>
+              <w:bottom w:w="80" w:type="dxa"/>
               <w:right w:w="75" w:type="dxa"/>
+              <w:start w:w="90" w:type="dxa"/>
+              <w:end w:w="90" w:type="dxa"/>
             </w:tcMar>
             <w:tcBorders>
               <w:top w:val="single" w:sz="4" w:color="D9D9D9"/>
               <w:left w:val="single" w:sz="4" w:color="D9D9D9"/>
               <w:bottom w:val="single" w:sz="4" w:color="D9D9D9"/>
               <w:right w:val="single" w:sz="4" w:color="D9D9D9"/>
+              <w:insideH w:val="single" w:sz="4" w:color="D9D9D9"/>
+              <w:insideV w:val="single" w:sz="4" w:color="D9D9D9"/>
             </w:tcBorders>
             <w:shd w:fill="E5EDF4"/>
           </w:tcPr>
           <w:p>
             <w:pPr>
-              <w:spacing w:after="20" w:line="240" w:lineRule="auto"/>
+              <w:spacing w:after="0" w:line="240" w:lineRule="auto" w:before="0"/>
+              <w:jc w:val="center"/>
             </w:pPr>
             <w:r>
               <w:rPr>
@@ -1012,22 +1223,27 @@
             <w:tcW w:type="dxa" w:w="936"/>
             <w:vAlign w:val="center"/>
             <w:tcMar>
-              <w:top w:w="75" w:type="dxa"/>
+              <w:top w:w="80" w:type="dxa"/>
               <w:left w:w="75" w:type="dxa"/>
-              <w:bottom w:w="75" w:type="dxa"/>
+              <w:bottom w:w="80" w:type="dxa"/>
               <w:right w:w="75" w:type="dxa"/>
+              <w:start w:w="90" w:type="dxa"/>
+              <w:end w:w="90" w:type="dxa"/>
             </w:tcMar>
             <w:tcBorders>
               <w:top w:val="single" w:sz="4" w:color="D9D9D9"/>
               <w:left w:val="single" w:sz="4" w:color="D9D9D9"/>
               <w:bottom w:val="single" w:sz="4" w:color="D9D9D9"/>
               <w:right w:val="single" w:sz="4" w:color="D9D9D9"/>
+              <w:insideH w:val="single" w:sz="4" w:color="D9D9D9"/>
+              <w:insideV w:val="single" w:sz="4" w:color="D9D9D9"/>
             </w:tcBorders>
             <w:shd w:fill="E5EDF4"/>
           </w:tcPr>
           <w:p>
             <w:pPr>
-              <w:spacing w:after="20" w:line="240" w:lineRule="auto"/>
+              <w:spacing w:after="0" w:line="240" w:lineRule="auto" w:before="0"/>
+              <w:jc w:val="center"/>
             </w:pPr>
             <w:r>
               <w:rPr>
@@ -1043,22 +1259,27 @@
             <w:tcW w:type="dxa" w:w="936"/>
             <w:vAlign w:val="center"/>
             <w:tcMar>
-              <w:top w:w="75" w:type="dxa"/>
+              <w:top w:w="80" w:type="dxa"/>
               <w:left w:w="75" w:type="dxa"/>
-              <w:bottom w:w="75" w:type="dxa"/>
+              <w:bottom w:w="80" w:type="dxa"/>
               <w:right w:w="75" w:type="dxa"/>
+              <w:start w:w="90" w:type="dxa"/>
+              <w:end w:w="90" w:type="dxa"/>
             </w:tcMar>
             <w:tcBorders>
               <w:top w:val="single" w:sz="4" w:color="D9D9D9"/>
               <w:left w:val="single" w:sz="4" w:color="D9D9D9"/>
               <w:bottom w:val="single" w:sz="4" w:color="D9D9D9"/>
               <w:right w:val="single" w:sz="4" w:color="D9D9D9"/>
+              <w:insideH w:val="single" w:sz="4" w:color="D9D9D9"/>
+              <w:insideV w:val="single" w:sz="4" w:color="D9D9D9"/>
             </w:tcBorders>
             <w:shd w:fill="E5EDF4"/>
           </w:tcPr>
           <w:p>
             <w:pPr>
-              <w:spacing w:after="20" w:line="240" w:lineRule="auto"/>
+              <w:spacing w:after="0" w:line="240" w:lineRule="auto" w:before="0"/>
+              <w:jc w:val="center"/>
             </w:pPr>
             <w:r>
               <w:rPr>
@@ -1074,22 +1295,27 @@
             <w:tcW w:type="dxa" w:w="936"/>
             <w:vAlign w:val="center"/>
             <w:tcMar>
-              <w:top w:w="75" w:type="dxa"/>
+              <w:top w:w="80" w:type="dxa"/>
               <w:left w:w="75" w:type="dxa"/>
-              <w:bottom w:w="75" w:type="dxa"/>
+              <w:bottom w:w="80" w:type="dxa"/>
               <w:right w:w="75" w:type="dxa"/>
+              <w:start w:w="90" w:type="dxa"/>
+              <w:end w:w="90" w:type="dxa"/>
             </w:tcMar>
             <w:tcBorders>
               <w:top w:val="single" w:sz="4" w:color="D9D9D9"/>
               <w:left w:val="single" w:sz="4" w:color="D9D9D9"/>
               <w:bottom w:val="single" w:sz="4" w:color="D9D9D9"/>
               <w:right w:val="single" w:sz="4" w:color="D9D9D9"/>
+              <w:insideH w:val="single" w:sz="4" w:color="D9D9D9"/>
+              <w:insideV w:val="single" w:sz="4" w:color="D9D9D9"/>
             </w:tcBorders>
             <w:shd w:fill="E5EDF4"/>
           </w:tcPr>
           <w:p>
             <w:pPr>
-              <w:spacing w:after="20" w:line="240" w:lineRule="auto"/>
+              <w:spacing w:after="0" w:line="240" w:lineRule="auto" w:before="0"/>
+              <w:jc w:val="center"/>
             </w:pPr>
             <w:r>
               <w:rPr>
@@ -1105,22 +1331,27 @@
             <w:tcW w:type="dxa" w:w="3528"/>
             <w:vAlign w:val="center"/>
             <w:tcMar>
-              <w:top w:w="75" w:type="dxa"/>
+              <w:top w:w="80" w:type="dxa"/>
               <w:left w:w="75" w:type="dxa"/>
-              <w:bottom w:w="75" w:type="dxa"/>
+              <w:bottom w:w="80" w:type="dxa"/>
               <w:right w:w="75" w:type="dxa"/>
+              <w:start w:w="90" w:type="dxa"/>
+              <w:end w:w="90" w:type="dxa"/>
             </w:tcMar>
             <w:tcBorders>
               <w:top w:val="single" w:sz="4" w:color="D9D9D9"/>
               <w:left w:val="single" w:sz="4" w:color="D9D9D9"/>
               <w:bottom w:val="single" w:sz="4" w:color="D9D9D9"/>
               <w:right w:val="single" w:sz="4" w:color="D9D9D9"/>
+              <w:insideH w:val="single" w:sz="4" w:color="D9D9D9"/>
+              <w:insideV w:val="single" w:sz="4" w:color="D9D9D9"/>
             </w:tcBorders>
             <w:shd w:fill="E5EDF4"/>
           </w:tcPr>
           <w:p>
             <w:pPr>
-              <w:spacing w:after="20" w:line="240" w:lineRule="auto"/>
+              <w:spacing w:after="0" w:line="240" w:lineRule="auto" w:before="0"/>
+              <w:jc w:val="left"/>
             </w:pPr>
             <w:r>
               <w:rPr>
@@ -1141,22 +1372,27 @@
             <w:tcW w:type="dxa" w:w="720"/>
             <w:vAlign w:val="center"/>
             <w:tcMar>
-              <w:top w:w="75" w:type="dxa"/>
+              <w:top w:w="80" w:type="dxa"/>
               <w:left w:w="75" w:type="dxa"/>
-              <w:bottom w:w="75" w:type="dxa"/>
+              <w:bottom w:w="80" w:type="dxa"/>
               <w:right w:w="75" w:type="dxa"/>
+              <w:start w:w="90" w:type="dxa"/>
+              <w:end w:w="90" w:type="dxa"/>
             </w:tcMar>
             <w:tcBorders>
               <w:top w:val="single" w:sz="4" w:color="D9D9D9"/>
               <w:left w:val="single" w:sz="4" w:color="D9D9D9"/>
               <w:bottom w:val="single" w:sz="4" w:color="D9D9D9"/>
               <w:right w:val="single" w:sz="4" w:color="D9D9D9"/>
+              <w:insideH w:val="single" w:sz="4" w:color="D9D9D9"/>
+              <w:insideV w:val="single" w:sz="4" w:color="D9D9D9"/>
             </w:tcBorders>
             <w:shd w:fill="FFFFFF"/>
           </w:tcPr>
           <w:p>
             <w:pPr>
-              <w:spacing w:after="20" w:line="240" w:lineRule="auto"/>
+              <w:spacing w:after="0" w:line="240" w:lineRule="auto" w:before="0"/>
+              <w:jc w:val="left"/>
             </w:pPr>
             <w:r>
               <w:rPr>
@@ -1172,22 +1408,27 @@
             <w:tcW w:type="dxa" w:w="1296"/>
             <w:vAlign w:val="center"/>
             <w:tcMar>
-              <w:top w:w="75" w:type="dxa"/>
+              <w:top w:w="80" w:type="dxa"/>
               <w:left w:w="75" w:type="dxa"/>
-              <w:bottom w:w="75" w:type="dxa"/>
+              <w:bottom w:w="80" w:type="dxa"/>
               <w:right w:w="75" w:type="dxa"/>
+              <w:start w:w="90" w:type="dxa"/>
+              <w:end w:w="90" w:type="dxa"/>
             </w:tcMar>
             <w:tcBorders>
               <w:top w:val="single" w:sz="4" w:color="D9D9D9"/>
               <w:left w:val="single" w:sz="4" w:color="D9D9D9"/>
               <w:bottom w:val="single" w:sz="4" w:color="D9D9D9"/>
               <w:right w:val="single" w:sz="4" w:color="D9D9D9"/>
+              <w:insideH w:val="single" w:sz="4" w:color="D9D9D9"/>
+              <w:insideV w:val="single" w:sz="4" w:color="D9D9D9"/>
             </w:tcBorders>
             <w:shd w:fill="FFFFFF"/>
           </w:tcPr>
           <w:p>
             <w:pPr>
-              <w:spacing w:after="20" w:line="240" w:lineRule="auto"/>
+              <w:spacing w:after="0" w:line="240" w:lineRule="auto" w:before="0"/>
+              <w:jc w:val="center"/>
             </w:pPr>
             <w:r>
               <w:rPr>
@@ -1203,22 +1444,27 @@
             <w:tcW w:type="dxa" w:w="1296"/>
             <w:vAlign w:val="center"/>
             <w:tcMar>
-              <w:top w:w="75" w:type="dxa"/>
+              <w:top w:w="80" w:type="dxa"/>
               <w:left w:w="75" w:type="dxa"/>
-              <w:bottom w:w="75" w:type="dxa"/>
+              <w:bottom w:w="80" w:type="dxa"/>
               <w:right w:w="75" w:type="dxa"/>
+              <w:start w:w="90" w:type="dxa"/>
+              <w:end w:w="90" w:type="dxa"/>
             </w:tcMar>
             <w:tcBorders>
               <w:top w:val="single" w:sz="4" w:color="D9D9D9"/>
               <w:left w:val="single" w:sz="4" w:color="D9D9D9"/>
               <w:bottom w:val="single" w:sz="4" w:color="D9D9D9"/>
               <w:right w:val="single" w:sz="4" w:color="D9D9D9"/>
+              <w:insideH w:val="single" w:sz="4" w:color="D9D9D9"/>
+              <w:insideV w:val="single" w:sz="4" w:color="D9D9D9"/>
             </w:tcBorders>
             <w:shd w:fill="FFFFFF"/>
           </w:tcPr>
           <w:p>
             <w:pPr>
-              <w:spacing w:after="20" w:line="240" w:lineRule="auto"/>
+              <w:spacing w:after="0" w:line="240" w:lineRule="auto" w:before="0"/>
+              <w:jc w:val="center"/>
             </w:pPr>
             <w:r>
               <w:rPr>
@@ -1234,22 +1480,27 @@
             <w:tcW w:type="dxa" w:w="936"/>
             <w:vAlign w:val="center"/>
             <w:tcMar>
-              <w:top w:w="75" w:type="dxa"/>
+              <w:top w:w="80" w:type="dxa"/>
               <w:left w:w="75" w:type="dxa"/>
-              <w:bottom w:w="75" w:type="dxa"/>
+              <w:bottom w:w="80" w:type="dxa"/>
               <w:right w:w="75" w:type="dxa"/>
+              <w:start w:w="90" w:type="dxa"/>
+              <w:end w:w="90" w:type="dxa"/>
             </w:tcMar>
             <w:tcBorders>
               <w:top w:val="single" w:sz="4" w:color="D9D9D9"/>
               <w:left w:val="single" w:sz="4" w:color="D9D9D9"/>
               <w:bottom w:val="single" w:sz="4" w:color="D9D9D9"/>
               <w:right w:val="single" w:sz="4" w:color="D9D9D9"/>
+              <w:insideH w:val="single" w:sz="4" w:color="D9D9D9"/>
+              <w:insideV w:val="single" w:sz="4" w:color="D9D9D9"/>
             </w:tcBorders>
             <w:shd w:fill="FFFFFF"/>
           </w:tcPr>
           <w:p>
             <w:pPr>
-              <w:spacing w:after="20" w:line="240" w:lineRule="auto"/>
+              <w:spacing w:after="0" w:line="240" w:lineRule="auto" w:before="0"/>
+              <w:jc w:val="center"/>
             </w:pPr>
             <w:r>
               <w:rPr>
@@ -1265,22 +1516,27 @@
             <w:tcW w:type="dxa" w:w="936"/>
             <w:vAlign w:val="center"/>
             <w:tcMar>
-              <w:top w:w="75" w:type="dxa"/>
+              <w:top w:w="80" w:type="dxa"/>
               <w:left w:w="75" w:type="dxa"/>
-              <w:bottom w:w="75" w:type="dxa"/>
+              <w:bottom w:w="80" w:type="dxa"/>
               <w:right w:w="75" w:type="dxa"/>
+              <w:start w:w="90" w:type="dxa"/>
+              <w:end w:w="90" w:type="dxa"/>
             </w:tcMar>
             <w:tcBorders>
               <w:top w:val="single" w:sz="4" w:color="D9D9D9"/>
               <w:left w:val="single" w:sz="4" w:color="D9D9D9"/>
               <w:bottom w:val="single" w:sz="4" w:color="D9D9D9"/>
               <w:right w:val="single" w:sz="4" w:color="D9D9D9"/>
+              <w:insideH w:val="single" w:sz="4" w:color="D9D9D9"/>
+              <w:insideV w:val="single" w:sz="4" w:color="D9D9D9"/>
             </w:tcBorders>
             <w:shd w:fill="FFFFFF"/>
           </w:tcPr>
           <w:p>
             <w:pPr>
-              <w:spacing w:after="20" w:line="240" w:lineRule="auto"/>
+              <w:spacing w:after="0" w:line="240" w:lineRule="auto" w:before="0"/>
+              <w:jc w:val="center"/>
             </w:pPr>
             <w:r>
               <w:rPr>
@@ -1296,22 +1552,27 @@
             <w:tcW w:type="dxa" w:w="936"/>
             <w:vAlign w:val="center"/>
             <w:tcMar>
-              <w:top w:w="75" w:type="dxa"/>
+              <w:top w:w="80" w:type="dxa"/>
               <w:left w:w="75" w:type="dxa"/>
-              <w:bottom w:w="75" w:type="dxa"/>
+              <w:bottom w:w="80" w:type="dxa"/>
               <w:right w:w="75" w:type="dxa"/>
+              <w:start w:w="90" w:type="dxa"/>
+              <w:end w:w="90" w:type="dxa"/>
             </w:tcMar>
             <w:tcBorders>
               <w:top w:val="single" w:sz="4" w:color="D9D9D9"/>
               <w:left w:val="single" w:sz="4" w:color="D9D9D9"/>
               <w:bottom w:val="single" w:sz="4" w:color="D9D9D9"/>
               <w:right w:val="single" w:sz="4" w:color="D9D9D9"/>
+              <w:insideH w:val="single" w:sz="4" w:color="D9D9D9"/>
+              <w:insideV w:val="single" w:sz="4" w:color="D9D9D9"/>
             </w:tcBorders>
             <w:shd w:fill="FFFFFF"/>
           </w:tcPr>
           <w:p>
             <w:pPr>
-              <w:spacing w:after="20" w:line="240" w:lineRule="auto"/>
+              <w:spacing w:after="0" w:line="240" w:lineRule="auto" w:before="0"/>
+              <w:jc w:val="center"/>
             </w:pPr>
             <w:r>
               <w:rPr>
@@ -1327,22 +1588,27 @@
             <w:tcW w:type="dxa" w:w="3528"/>
             <w:vAlign w:val="center"/>
             <w:tcMar>
-              <w:top w:w="75" w:type="dxa"/>
+              <w:top w:w="80" w:type="dxa"/>
               <w:left w:w="75" w:type="dxa"/>
-              <w:bottom w:w="75" w:type="dxa"/>
+              <w:bottom w:w="80" w:type="dxa"/>
               <w:right w:w="75" w:type="dxa"/>
+              <w:start w:w="90" w:type="dxa"/>
+              <w:end w:w="90" w:type="dxa"/>
             </w:tcMar>
             <w:tcBorders>
               <w:top w:val="single" w:sz="4" w:color="D9D9D9"/>
               <w:left w:val="single" w:sz="4" w:color="D9D9D9"/>
               <w:bottom w:val="single" w:sz="4" w:color="D9D9D9"/>
               <w:right w:val="single" w:sz="4" w:color="D9D9D9"/>
+              <w:insideH w:val="single" w:sz="4" w:color="D9D9D9"/>
+              <w:insideV w:val="single" w:sz="4" w:color="D9D9D9"/>
             </w:tcBorders>
             <w:shd w:fill="FFFFFF"/>
           </w:tcPr>
           <w:p>
             <w:pPr>
-              <w:spacing w:after="20" w:line="240" w:lineRule="auto"/>
+              <w:spacing w:after="0" w:line="240" w:lineRule="auto" w:before="0"/>
+              <w:jc w:val="left"/>
             </w:pPr>
             <w:r>
               <w:rPr>

</xml_diff>